<commit_message>
Deplace INSTALLATION.txt vers packaging/ et corrige des mentions obsoletes dans le rapport de stage
INSTALLATION.txt decrit comment installer les executables produits par
packaging/ (pour un utilisateur SED recevant une cle USB) - son public
et son propos n'ont rien a voir avec le rapport de stage (docs/), donc
il colle mieux avec packaging/ (construction ET installation des
executables) qu'avec docs/ (documentation du projet).

Dans le rapport de stage (Chapitre 3, Annexe A) : la puce services/ et
le schema SmartArt de l'architecture en couches ne mentionnaient pas
l'import comme responsabilite de app/services/, alors que
import_meteo.py et import_manuel.py y ont ete deplaces lors de la
restructuration (commit 689a2f1). Le reste de la description (models/,
views/, workers/, database.py, ML/) correspondait deja exactement au
code reel.
</commit_message>
<xml_diff>
--- a/docs/STAGE PROFESIONNEL/Rapport de stage.docx
+++ b/docs/STAGE PROFESIONNEL/Rapport de stage.docx
@@ -6553,7 +6553,7 @@
           <w:rFonts w:asciiTheme="majorBidi" w:hAnsiTheme="majorBidi" w:cstheme="majorBidi"/>
           <w:lang w:val="fr-FR"/>
         </w:rPr>
-        <w:t>services/ — logique métier : calcul des indicateurs, génération des alertes, génération des rapports, envoi d'e-mails, sauvegarde, historique, planification, prévision et détection d'anomalies par apprentissage automatique ;</w:t>
+        <w:t>services/ — logique métier : import des mesures, calcul des indicateurs, génération des alertes, génération des rapports, envoi d'e-mails, sauvegarde, historique, planification, prévision et détection d'anomalies par apprentissage automatique ;</w:t>
       </w:r>
     </w:p>
     <w:p>
@@ -12378,7 +12378,7 @@
           <w:rFonts w:asciiTheme="majorBidi" w:hAnsiTheme="majorBidi" w:cstheme="majorBidi"/>
           <w:lang w:val="fr-FR"/>
         </w:rPr>
-        <w:t>Afin de permettre un déploiement sur les postes du SED sans installation préalable de Python ni de ses dépendances, l'application est packagée en exécutable Windows autonome à l'aide de PyInstaller, à partir d'un fichier de configuration dédié (ORMVAG-Meteo.spec) définissant un exécutable unique (« one-file »), sans console, avec icône personnalisée.</w:t>
+        <w:t>Afin de permettre un déploiement sur les postes du SED sans installation préalable de Python ni de ses dépendances, l'application est packagée en exécutable Windows autonome à l'aide de PyInstaller, à partir d'un fichier de configuration dédié (packaging/ORMVAG-Meteo.spec) définissant un exécutable autonome, sans console, avec icône personnalisée.</w:t>
       </w:r>
     </w:p>
     <w:p>
@@ -12480,7 +12480,7 @@
           <w:rFonts w:asciiTheme="majorBidi" w:hAnsiTheme="majorBidi" w:cstheme="majorBidi"/>
           <w:lang w:val="fr-FR"/>
         </w:rPr>
-        <w:t>le détecteur d'anomalies (Isolation Forest) est chargé dynamiquement depuis un fichier joblib au moment de son utilisation, sans jamais faire "import sklearn" explicitement dans le code ; PyInstaller, qui analyse statiquement les imports pour décider quoi embarquer, ne détectait donc jamais scikit-learn comme dépendance, provoquant un ModuleNotFoundError silencieusement avalé par le mode fenêtré ("windowed", sans console) dès l'ouverture de la page Indicateurs, qui restait alors bloquée indéfiniment sur "Chargement…" sans aucun message d'erreur visible ; corrigé en forçant scikit-learn dans les imports du fichier de configuration PyInstaller. Un gestionnaire d'erreurs global journalisant désormais toute exception non interceptée dans un fichier erreur.log a également été ajouté, pour qu'un futur échec silencieux de ce type reste visible plutôt que de se manifester par un simple blocage sans explication.</w:t>
+        <w:t>le détecteur d'anomalies (Isolation Forest) est chargé dynamiquement depuis un fichier joblib au moment de son utilisation, sans jamais faire "import sklearn" explicitement dans le code ; PyInstaller, qui analyse statiquement les imports pour décider quoi embarquer, ne détectait donc jamais scikit-learn comme dépendance, provoquant un ModuleNotFoundError silencieusement avalé par le mode fenêtré ("windowed", sans console) dès l'ouverture de la page Indicateurs, qui restait alors bloquée indéfiniment sur "Chargement…" sans aucun message d'erreur visible ; corrigé en forçant scikit-learn dans les imports du fichier de configuration PyInstaller. Un gestionnaire d'erreurs global journalisant désormais toute exception non interceptée dans un fichier erreur.log a également été ajouté, pour qu'un futur échec silencieux de ce type reste visible plutôt que de se manifester par un simple blocage sans explication. Un journal complémentaire (app.log) trace par ailleurs le déroulement normal de la tâche planifiée quotidienne ainsi que les erreurs qui y sont déjà interceptées, l’application ne disposant d’aucune console où ces informations pourraient sinon apparaître.</w:t>
       </w:r>
     </w:p>
     <w:p>
@@ -12532,7 +12532,7 @@
           <w:rFonts w:asciiTheme="majorBidi" w:hAnsiTheme="majorBidi" w:cstheme="majorBidi"/>
           <w:lang w:val="fr-FR"/>
         </w:rPr>
-        <w:t>Pour faciliter le déploiement sur un poste ne disposant pas encore de PostgreSQL, un installateur autonome (Installateur-ORMVAG.exe, installateur/installer.py) a été développé en complément : il détecte si une instance PostgreSQL est déjà active sur le poste, sinon installe silencieusement PostgreSQL 18 à partir de l'installeur officiel EnterpriseDB embarqué, crée la base de données et son schéma, puis initialise les données de base (rôles, compte administrateur, stations réelles du réseau). Cette logique d'initialisation (app/services/premier_demarrage.py) est partagée avec les scripts de seed utilisés en développement, afin d'éviter toute duplication entre les deux usages.</w:t>
+        <w:t>Pour faciliter le déploiement sur un poste ne disposant pas encore de PostgreSQL, un installateur autonome (Installateur-ORMVAG.exe, packaging/installateur/installer.py) a été développé en complément : il détecte si une instance PostgreSQL est déjà active sur le poste, sinon installe silencieusement PostgreSQL 18 à partir de l'installeur officiel EnterpriseDB embarqué, crée la base de données et son schéma, puis initialise les données de base (rôles, compte administrateur, stations réelles du réseau). Cette logique d'initialisation (app/services/premier_demarrage.py) est partagée avec les scripts de seed utilisés en développement, afin d'éviter toute duplication entre les deux usages.</w:t>
       </w:r>
     </w:p>
     <w:p>
@@ -17307,6 +17307,74 @@
           <w:lang w:val="fr-FR"/>
         </w:rPr>
         <w:t>ML/ — pipeline machine learning (diagnostic, nettoyage, préparation, entraînement)</w:t>
+      </w:r>
+    </w:p>
+    <w:p>
+      <w:pPr>
+        <w:spacing w:line="312" w:lineRule="auto"/>
+        <w:jc w:val="both"/>
+        <w:rPr>
+          <w:rFonts w:asciiTheme="majorBidi" w:hAnsiTheme="majorBidi" w:cstheme="majorBidi"/>
+          <w:lang w:val="fr-FR"/>
+        </w:rPr>
+      </w:pPr>
+      <w:r>
+        <w:rPr>
+          <w:rFonts w:asciiTheme="majorBidi" w:hAnsiTheme="majorBidi" w:cstheme="majorBidi"/>
+          <w:lang w:val="fr-FR"/>
+        </w:rPr>
+        <w:t>outils/ — scripts de développement (initialisation de la base, import d’historique, connexion), jamais exécutés par l’application packagée</w:t>
+      </w:r>
+    </w:p>
+    <w:p>
+      <w:pPr>
+        <w:spacing w:line="312" w:lineRule="auto"/>
+        <w:jc w:val="both"/>
+        <w:rPr>
+          <w:rFonts w:asciiTheme="majorBidi" w:hAnsiTheme="majorBidi" w:cstheme="majorBidi"/>
+          <w:lang w:val="fr-FR"/>
+        </w:rPr>
+      </w:pPr>
+      <w:r>
+        <w:rPr>
+          <w:rFonts w:asciiTheme="majorBidi" w:hAnsiTheme="majorBidi" w:cstheme="majorBidi"/>
+          <w:lang w:val="fr-FR"/>
+        </w:rPr>
+        <w:t>packaging/ — configuration et scripts de construction des exécutables (fichiers .spec, installateur PostgreSQL autonome)</w:t>
+      </w:r>
+    </w:p>
+    <w:p>
+      <w:pPr>
+        <w:spacing w:line="312" w:lineRule="auto"/>
+        <w:jc w:val="both"/>
+        <w:rPr>
+          <w:rFonts w:asciiTheme="majorBidi" w:hAnsiTheme="majorBidi" w:cstheme="majorBidi"/>
+          <w:lang w:val="fr-FR"/>
+        </w:rPr>
+      </w:pPr>
+      <w:r>
+        <w:rPr>
+          <w:rFonts w:asciiTheme="majorBidi" w:hAnsiTheme="majorBidi" w:cstheme="majorBidi"/>
+          <w:lang w:val="fr-FR"/>
+        </w:rPr>
+        <w:t>docs/ — documentation (guide d’installation, rapport de stage)</w:t>
+      </w:r>
+    </w:p>
+    <w:p>
+      <w:pPr>
+        <w:spacing w:line="312" w:lineRule="auto"/>
+        <w:jc w:val="both"/>
+        <w:rPr>
+          <w:rFonts w:asciiTheme="majorBidi" w:hAnsiTheme="majorBidi" w:cstheme="majorBidi"/>
+          <w:lang w:val="fr-FR"/>
+        </w:rPr>
+      </w:pPr>
+      <w:r>
+        <w:rPr>
+          <w:rFonts w:asciiTheme="majorBidi" w:hAnsiTheme="majorBidi" w:cstheme="majorBidi"/>
+          <w:lang w:val="fr-FR"/>
+        </w:rPr>
+        <w:t>assets/ — logo et icônes de l’application</w:t>
       </w:r>
     </w:p>
     <w:p>
@@ -32249,7 +32317,7 @@
               <a:latin typeface="Times New Roman" panose="02020603050405020304" pitchFamily="18" charset="0"/>
               <a:cs typeface="Times New Roman" panose="02020603050405020304" pitchFamily="18" charset="0"/>
             </a:rPr>
-            <a:t>app/services/ — indicateurs · alertes · rapports · email · sauvegarde · historique · planification · ML</a:t>
+            <a:t>app/services/ — import · indicateurs · alertes · rapports · email · sauvegarde · historique · planification · ML</a:t>
           </a:r>
           <a:endParaRPr lang="fr-FR" sz="1100">
             <a:latin typeface="Times New Roman" panose="02020603050405020304" pitchFamily="18" charset="0"/>
@@ -33606,7 +33674,7 @@
               <a:latin typeface="Times New Roman" panose="02020603050405020304" pitchFamily="18" charset="0"/>
               <a:cs typeface="Times New Roman" panose="02020603050405020304" pitchFamily="18" charset="0"/>
             </a:rPr>
-            <a:t>app/services/ — indicateurs · alertes · rapports · email · sauvegarde · historique · planification · ML</a:t>
+            <a:t>app/services/ — import · indicateurs · alertes · rapports · email · sauvegarde · historique · planification · ML</a:t>
           </a:r>
           <a:endParaRPr lang="fr-FR" sz="1100" kern="1200">
             <a:latin typeface="Times New Roman" panose="02020603050405020304" pitchFamily="18" charset="0"/>

</xml_diff>